<commit_message>
Arreglos minimos y documentacion final actualizad
</commit_message>
<xml_diff>
--- a/docs/Informe arquitectura Ajedrez Minecraft.docx
+++ b/docs/Informe arquitectura Ajedrez Minecraft.docx
@@ -20,7 +20,7 @@
     </w:p>
     <w:p>
       <w:r>
-        <w:t>Ingeniería de Software · Trabajo práctico de ajedrez · 12 de octubre de 2026</w:t>
+        <w:t>Ingeniería de Software · Trabajo práctico de ajedrez · 16 de octubre de 2026</w:t>
       </w:r>
     </w:p>
     <w:p>
@@ -763,14 +763,8 @@
             </w:tcMar>
           </w:tcPr>
           <w:p>
-            <w:pPr>
-              <w:spacing w:after="40" w:before="40" w:line="245" w:lineRule="auto"/>
-            </w:pPr>
             <w:r>
-              <w:rPr>
-                <w:sz w:val="19"/>
-              </w:rPr>
-              <w:t>Identifica los seis tipos, sus personajes y sus valores. El rey tiene valor null, porque no posee puntaje numérico.</w:t>
+              <w:t>Identifica los seis tipos con sus etiquetas y valores. Los personajes pertenecen a la presentación web. El rey tiene valor null porque no posee puntaje numérico.</w:t>
             </w:r>
           </w:p>
         </w:tc>
@@ -1134,14 +1128,8 @@
             </w:tcMar>
           </w:tcPr>
           <w:p>
-            <w:pPr>
-              <w:spacing w:after="40" w:before="40" w:line="245" w:lineRule="auto"/>
-            </w:pPr>
             <w:r>
-              <w:rPr>
-                <w:sz w:val="19"/>
-              </w:rPr>
-              <w:t>Comprueba turno, límites, destino, movimiento, enroque y seguridad del rey mediante una simulación.</w:t>
+              <w:t>Comprueba turno, límites, destino, movimiento, enroque y seguridad del rey mediante una simulación. Devuelve ValidationResult, un enum con VALID o un motivo de rechazo sin texto de UI.</w:t>
             </w:r>
           </w:p>
         </w:tc>
@@ -1407,14 +1395,8 @@
             </w:tcMar>
           </w:tcPr>
           <w:p>
-            <w:pPr>
-              <w:spacing w:after="40" w:before="40" w:line="245" w:lineRule="auto"/>
-            </w:pPr>
             <w:r>
-              <w:rPr>
-                <w:sz w:val="19"/>
-              </w:rPr>
-              <w:t>Move describe origen, destino y promoción. MoveResult indica si se aceptó la solicitud y comunica un mensaje.</w:t>
+              <w:t>Move describe origen, destino y promoción. MoveResult indica aceptación y conserva los mensajes previos; los rechazos del validador se exponen mediante Optional&lt;ValidationResult&gt;.</w:t>
             </w:r>
           </w:p>
         </w:tc>
@@ -3059,7 +3041,7 @@
     </w:p>
     <w:p>
       <w:r>
-        <w:t>Las 31 pruebas originales verifican estrategias, jaques, finales, jugadas especiales, restauración y 8.902 posiciones legales a profundidad tres. Otras 16 pruebas comprueban puntaje, ganador, cinco niveles, guardado, recuperación, reloj y fallo de escritura. Se ejecutan sin navegador con run.ps1 -Test.</w:t>
+        <w:t>Las 53 pruebas se ejecutan con Maven y JUnit 5: 31 en ChessTest, 16 en FeatureTest, 4 en ValidationTest y 2 en BoardPathTest. Se conservan reglas especiales, undo/redo, IA, persistencia y perft 20/400/8902. Los nuevos tests verifican motivos semánticos, su traducción y trayectorias inválidas. La ejecución limpia final pasó sin fallos ni errores.</w:t>
       </w:r>
     </w:p>
     <w:p>
@@ -3083,6 +3065,136 @@
     <w:p>
       <w:r>
         <w:t>Se aplican arquitectura de la unidad 00; SOLID, composición, patrones y pruebas de la unidad 01; y caché y búsqueda acotada de la unidad 04. Los contratos son interfaces de código, no un SLA de un proveedor externo.</w:t>
+      </w:r>
+    </w:p>
+    <w:p>
+      <w:pPr>
+        <w:pStyle w:val="Heading1"/>
+        <w:pageBreakBefore/>
+      </w:pPr>
+      <w:r>
+        <w:t>Revisión final del diseño</w:t>
+      </w:r>
+    </w:p>
+    <w:p>
+      <w:r>
+        <w:t>El alcance acordado con el docente prioriza estabilidad y simplicidad. Conservamos Board.SIZE = 8, Position para coordenadas estándar y el catálogo PieceType. La revisión no agrega un motor de variantes ni un registro dinámico de piezas.</w:t>
+      </w:r>
+    </w:p>
+    <w:p>
+      <w:pPr>
+        <w:pStyle w:val="Heading2"/>
+      </w:pPr>
+      <w:r>
+        <w:t>Validación tipada</w:t>
+      </w:r>
+    </w:p>
+    <w:p>
+      <w:r>
+        <w:t>Qué hicimos: MoveValidator devuelve ValidationResult, con VALID y nueve motivos de rechazo. Game propaga el motivo en MoveResult.getValidationResult(). MoveMessages, ubicado en app, lo traduce para WebServer y ConsoleUI. Los movimientos inválidos normales no lanzan excepciones.</w:t>
+      </w:r>
+    </w:p>
+    <w:p>
+      <w:r>
+        <w:t>Por qué: la regla de dominio puede probarse sin comparar texto de pantalla. Cuándo cambiaría: si un rechazo necesitara parámetros como una casilla, usaríamos un resultado con motivo y datos. Los mensajes de sesión y las etiquetas del historial conservan su contrato anterior; no se afirma una internacionalización completa.</w:t>
+      </w:r>
+    </w:p>
+    <w:p>
+      <w:pPr>
+        <w:pStyle w:val="Heading2"/>
+      </w:pPr>
+      <w:r>
+        <w:t>Corrección de trayectorias</w:t>
+      </w:r>
+    </w:p>
+    <w:p>
+      <w:r>
+        <w:t>Qué hicimos: Board.pathClear devuelve false para extremos inválidos y trayectorias que no son rectas ni diagonales. Por qué: una llamada no alineada podía no terminar, aunque las estrategias estándar ya la filtraban. Cuándo cambiaría: una trayectoria diferente necesitaría otro contrato, sin alterar el significado de este recorrido.</w:t>
+      </w:r>
+    </w:p>
+    <w:p>
+      <w:pPr>
+        <w:pStyle w:val="Heading2"/>
+      </w:pPr>
+      <w:r>
+        <w:t>Extensibilidad de piezas</w:t>
+      </w:r>
+    </w:p>
+    <w:p>
+      <w:r>
+        <w:t>Qué conservamos: Piece recibe IMovementStrategy, PieceFactory centraliza su creación y PieceType enumera los tipos. Una pieza nueva agrega una estrategia y se configura en el enum y la fábrica. Por qué: estos cambios explícitos son pequeños y defendibles. Cuándo cambiaría: muchas variantes o tipos cargados en ejecución podrían justificar otro catálogo.</w:t>
+      </w:r>
+    </w:p>
+    <w:p>
+      <w:r>
+        <w:t>La extensión no es 100 % Open/Closed: setup, personajes, tutorial y símbolo de consola necesitan configuración. Permitir promoción a otra pieza exige revisar MoveValidator, MinimaxAi y el selector web. Efectos nuevos sobre varias casillas requieren revisar MoveCommand y la repetición. No se cambia la arquitectura únicamente para evitar estos puntos centrales.</w:t>
+      </w:r>
+    </w:p>
+    <w:p>
+      <w:r>
+        <w:br w:type="page"/>
+      </w:r>
+    </w:p>
+    <w:p>
+      <w:pPr>
+        <w:pStyle w:val="Heading1"/>
+      </w:pPr>
+      <w:r>
+        <w:t>Tablero estándar y defensa</w:t>
+      </w:r>
+    </w:p>
+    <w:p>
+      <w:r>
+        <w:t>Qué conservamos: una matriz 8×8 y notación de a1 a h8. Por qué: corresponde al juego implementado y no existe una variante requerida. Cuándo cambiaría: ante una variante concreta, con setup y reglas definidos antes de programar.</w:t>
+      </w:r>
+    </w:p>
+    <w:p>
+      <w:r>
+        <w:t>Para otro tamaño habría que parametrizar Board y adaptar contains, copy y restore; revisar recorridos en Game, CheckDetector y MinimaxAi; y definir conversiones de Position con dimensiones explícitas. También cambian filas de peones, promoción, enroque, derechos de repetición, material insuficiente y heurísticas. La consola, web y persistencia necesitarían representar la nueva configuración. Cambiar sólo SIZE no alcanza.</w:t>
+      </w:r>
+    </w:p>
+    <w:p>
+      <w:pPr>
+        <w:pStyle w:val="Heading2"/>
+      </w:pPr>
+      <w:r>
+        <w:t>UML contrastado con el código</w:t>
+      </w:r>
+    </w:p>
+    <w:p>
+      <w:r>
+        <w:t>docs/UML-Ajedrez-TPO.puml y su PDF contienen seis vistas: tablero y piezas, estrategias, partida e historial, validación y traducción, sesión e IA, y adaptadores. Muestran los 37 tipos públicos de producción y la API pública declarada. Se omiten miembros privados, heredados y generados automáticamente por Java para mejorar la lectura.</w:t>
+      </w:r>
+    </w:p>
+    <w:p>
+      <w:r>
+        <w:t>Las firmas se obtuvieron de las clases compiladas. StandardGame.create devuelve Game. Move y Position son clases finales. ValidationResult es un enum. Game implementa IGameService; MatchSession implementa IMatchService; FileGameRepository implementa IGameRepository; MinimaxAi implementa IChessAi. Sólo PawnMovement redefine canAttack; QueenMovement hereda la implementación por defecto.</w:t>
+      </w:r>
+    </w:p>
+    <w:p>
+      <w:pPr>
+        <w:pStyle w:val="Heading2"/>
+      </w:pPr>
+      <w:r>
+        <w:t>Dependencias y decisiones conservadas</w:t>
+      </w:r>
+    </w:p>
+    <w:p>
+      <w:r>
+        <w:t>El núcleo no importa adaptadores, HTTP ni archivos. La inyección manual por constructor permite sustituir repositorio, IA y reloj. Command mantiene una copia de 64 referencias y metadatos para deshacer; se cambiaría por diferencias sólo si mediciones de memoria lo justificaran. No se agregan State, Observer, Spring ni frameworks de DI.</w:t>
+      </w:r>
+    </w:p>
+    <w:p>
+      <w:pPr>
+        <w:pStyle w:val="Heading2"/>
+      </w:pPr>
+      <w:r>
+        <w:t>Evidencia y límites</w:t>
+      </w:r>
+    </w:p>
+    <w:p>
+      <w:r>
+        <w:t>La suite inicial limpia pasó 47 pruebas. Una ejecución previa sin clean encontró clases antiguas en target que ya no tenían fuente; la limpieza eliminó esos residuos. La suite final pasa 53 pruebas. La integración existente de archivo usa @TempDir; las nuevas pruebas no necesitan red, disco ni navegador. Esta revisión no incluye una nueva comprobación visual de la web.</w:t>
       </w:r>
     </w:p>
     <w:sectPr>

</xml_diff>

<commit_message>
Completar etapas 5 y 6: rendimiento medido, integridad y documentación actualizada
</commit_message>
<xml_diff>
--- a/docs/Informe arquitectura Ajedrez Minecraft.docx
+++ b/docs/Informe arquitectura Ajedrez Minecraft.docx
@@ -20,7 +20,7 @@
     </w:p>
     <w:p>
       <w:r>
-        <w:t>Ingeniería de Software · Trabajo práctico de ajedrez · 16 de octubre de 2026</w:t>
+        <w:t>Ingeniería de Software · Trabajo práctico de ajedrez · Actualizado el 31 de octubre de 2026 · Presentación el 6 de noviembre</w:t>
       </w:r>
     </w:p>
     <w:p>
@@ -1552,10 +1552,7 @@
               <w:spacing w:after="40" w:before="40" w:line="245" w:lineRule="auto"/>
             </w:pPr>
             <w:r>
-              <w:rPr>
-                <w:sz w:val="19"/>
-              </w:rPr>
-              <w:t>Puerto y servicio de sesión: nueva partida, modo, intervención de IA, guardado y cronómetro.</w:t>
+              <w:t>Puerto y servicio de sesión: nueva partida, modo, IA, guardado, presence(clientId, active), isClockRunning y tiempo activo.</w:t>
             </w:r>
           </w:p>
         </w:tc>
@@ -1658,10 +1655,7 @@
               <w:spacing w:after="40" w:before="40" w:line="245" w:lineRule="auto"/>
             </w:pPr>
             <w:r>
-              <w:rPr>
-                <w:sz w:val="19"/>
-              </w:rPr>
-              <w:t>Datos del guardado: secuencia de movimientos, posición actual del historial, modo, nivel y marcas de tiempo.</w:t>
+              <w:t>Datos del guardado: secuencia de movimientos, cursor del historial, modo, nivel, marcas de tiempo y elapsedMillis, el tiempo activo acumulado.</w:t>
             </w:r>
           </w:p>
         </w:tc>
@@ -1806,7 +1800,7 @@
     </w:p>
     <w:p>
       <w:r>
-        <w:t>MatchSession recibe un Clock por constructor. El tiempo cuenta desde la creación de la partida, incluso durante un cierre, y se detiene al terminar. En modo solo, el humano juega con blancas y la IA con negras. Deshacer normalmente revierte la jugada humana y la respuesta de la IA, para volver a la decisión anterior.</w:t>
+        <w:t>MatchSession recibe un Clock por constructor. El cronómetro acumula tiempo solo mientras existe al menos una vista activa y visible; varias pestañas no duplican el tiempo. Al cerrar u ocultar el juego se pausa y al terminar la partida se detiene. La web renueva actividad cada 5 segundos y esta vence a los 15 segundos si no llega aviso de salida. En modo solo, el humano juega con blancas y la IA con negras. Deshacer normalmente revierte la jugada humana y la respuesta de la IA.</w:t>
       </w:r>
     </w:p>
     <w:p>
@@ -3041,12 +3035,12 @@
     </w:p>
     <w:p>
       <w:r>
-        <w:t>Las 53 pruebas se ejecutan con Maven y JUnit 5: 31 en ChessTest, 16 en FeatureTest, 4 en ValidationTest y 2 en BoardPathTest. Se conservan reglas especiales, undo/redo, IA, persistencia y perft 20/400/8902. Los nuevos tests verifican motivos semánticos, su traducción y trayectorias inválidas. La ejecución limpia final pasó sin fallos ni errores.</w:t>
+        <w:t>La ejecución limpia del 31/10/2026 aprobó 62 pruebas con Maven y JUnit 5: 31 en ChessTest, 16 en FeatureTest, 4 en ValidationTest, 2 en BoardPathTest y 9 en ActivityClockTest. No hubo fallos, errores ni omisiones. Incluyen reglas especiales, undo/redo, IA, persistencia, perft 20/400/8902, motivos semánticos y reloj activo. Los informes y el manifiesto de fuentes están en docs/evidencias/2026-10-31-etapa4-83903e2/.</w:t>
       </w:r>
     </w:p>
     <w:p>
       <w:r>
-        <w:t>Los nuevos tests utilizan un repositorio en memoria y un reloj controlado: son dobles que permiten comprobar guardado y tiempo sin depender del disco o de esperar segundos reales. Una prueba adicional de esa suite utiliza el adaptador de archivo real.</w:t>
+        <w:t>La suite combina repositorios en memoria, relojes controlados y pruebas del adaptador de archivo en directorios temporales. Estos dobles permiten comprobar escenarios sin esperas reales. Las comprobaciones de navegador se ejecutan por separado y no integran el conteo de 62 pruebas Java.</w:t>
       </w:r>
     </w:p>
     <w:p>
@@ -3078,7 +3072,7 @@
     </w:p>
     <w:p>
       <w:r>
-        <w:t>El alcance acordado con el docente prioriza estabilidad y simplicidad. Conservamos Board.SIZE = 8, Position para coordenadas estándar y el catálogo PieceType. La revisión no agrega un motor de variantes ni un registro dinámico de piezas.</w:t>
+        <w:t>La consigna confirmada por el docente exige que los diagramas coincidan con las clases del programa. La revisión conserva el alcance implementado: Board.SIZE = 8, Position para coordenadas estándar y el catálogo PieceType. No agrega un motor de variantes ni un registro dinámico de piezas.</w:t>
       </w:r>
     </w:p>
     <w:p>
@@ -3194,7 +3188,273 @@
     </w:p>
     <w:p>
       <w:r>
-        <w:t>La suite inicial limpia pasó 47 pruebas. Una ejecución previa sin clean encontró clases antiguas en target que ya no tenían fuente; la limpieza eliminó esos residuos. La suite final pasa 53 pruebas. La integración existente de archivo usa @TempDir; las nuevas pruebas no necesitan red, disco ni navegador. Esta revisión no incluye una nueva comprobación visual de la web.</w:t>
+        <w:t>Las cifras 47 y 53 corresponden a revisiones anteriores. La campaña vigente aprobó 62 pruebas Java; el código de producción no cambió entre esa campaña y las mediciones de las etapas 5 y 6. También se verificaron tutorial, cinco niveles, puntos, mate, recarga, undo/redo, vista de 390 px, activación de casillas con Enter, consola y un simulacro automatizado de respaldo. Esta evidencia no sustituye la revisión por otro integrante ni el ensayo de exposición.</w:t>
+      </w:r>
+    </w:p>
+    <w:p>
+      <w:r>
+        <w:br w:type="page"/>
+      </w:r>
+    </w:p>
+    <w:p>
+      <w:pPr>
+        <w:pStyle w:val="Heading1"/>
+      </w:pPr>
+      <w:r>
+        <w:t>Rendimiento observado</w:t>
+      </w:r>
+    </w:p>
+    <w:p>
+      <w:r>
+        <w:t>La etapa 5 midió el commit d37cbe4c39bd434915e2f822d06195bae3e95a69 el 31/10/2026. Equipo: Intel Core i7-1255U, 10 núcleos y 12 procesadores lógicos, 16 GB de RAM y Windows 11. Java 21.0.6, heap de 128 a 512 MiB y JFR con configuración profile. El navegador se midió por separado con Chrome 155, Playwright 1.62.1 y métricas de DevTools.</w:t>
+      </w:r>
+    </w:p>
+    <w:p>
+      <w:pPr>
+        <w:pStyle w:val="Heading2"/>
+      </w:pPr>
+      <w:r>
+        <w:t>Escenarios y resultados</w:t>
+      </w:r>
+    </w:p>
+    <w:tbl>
+      <w:tblPr>
+        <w:tblStyle w:val="TableGrid"/>
+        <w:tblW w:type="auto" w:w="0"/>
+        <w:tblLook w:firstColumn="1" w:firstRow="1" w:lastColumn="0" w:lastRow="0" w:noHBand="0" w:noVBand="1" w:val="04A0"/>
+      </w:tblPr>
+      <w:tblGrid>
+        <w:gridCol w:w="3216"/>
+        <w:gridCol w:w="3216"/>
+        <w:gridCol w:w="3216"/>
+      </w:tblGrid>
+      <w:tr>
+        <w:tc>
+          <w:tcPr>
+            <w:tcW w:type="dxa" w:w="3216"/>
+          </w:tcPr>
+          <w:p>
+            <w:r>
+              <w:t>Escenario</w:t>
+            </w:r>
+          </w:p>
+        </w:tc>
+        <w:tc>
+          <w:tcPr>
+            <w:tcW w:type="dxa" w:w="3216"/>
+          </w:tcPr>
+          <w:p>
+            <w:r>
+              <w:t>Repeticiones</w:t>
+            </w:r>
+          </w:p>
+        </w:tc>
+        <w:tc>
+          <w:tcPr>
+            <w:tcW w:type="dxa" w:w="3216"/>
+          </w:tcPr>
+          <w:p>
+            <w:r>
+              <w:t>Resultado observado</w:t>
+            </w:r>
+          </w:p>
+        </w:tc>
+      </w:tr>
+      <w:tr>
+        <w:tc>
+          <w:tcPr>
+            <w:tcW w:type="dxa" w:w="3216"/>
+          </w:tcPr>
+          <w:p>
+            <w:r>
+              <w:t>Destinos legales de b5 en Java</w:t>
+            </w:r>
+          </w:p>
+        </w:tc>
+        <w:tc>
+          <w:tcPr>
+            <w:tcW w:type="dxa" w:w="3216"/>
+          </w:tcPr>
+          <w:p>
+            <w:r>
+              <w:t>500 calentamientos y 1.000 muestras</w:t>
+            </w:r>
+          </w:p>
+        </w:tc>
+        <w:tc>
+          <w:tcPr>
+            <w:tcW w:type="dxa" w:w="3216"/>
+          </w:tcPr>
+          <w:p>
+            <w:r>
+              <w:t>Mediana 0,0221 ms; p95 0,0426 ms.</w:t>
+            </w:r>
+          </w:p>
+        </w:tc>
+      </w:tr>
+      <w:tr>
+        <w:tc>
+          <w:tcPr>
+            <w:tcW w:type="dxa" w:w="3216"/>
+          </w:tcPr>
+          <w:p>
+            <w:r>
+              <w:t>IA EXTREME con posición fija</w:t>
+            </w:r>
+          </w:p>
+        </w:tc>
+        <w:tc>
+          <w:tcPr>
+            <w:tcW w:type="dxa" w:w="3216"/>
+          </w:tcPr>
+          <w:p>
+            <w:r>
+              <w:t>3 calentamientos y 10 muestras</w:t>
+            </w:r>
+          </w:p>
+        </w:tc>
+        <w:tc>
+          <w:tcPr>
+            <w:tcW w:type="dxa" w:w="3216"/>
+          </w:tcPr>
+          <w:p>
+            <w:r>
+              <w:t>Mediana 1,375 s; máximo 1,611 s.</w:t>
+            </w:r>
+          </w:p>
+        </w:tc>
+      </w:tr>
+      <w:tr>
+        <w:tc>
+          <w:tcPr>
+            <w:tcW w:type="dxa" w:w="3216"/>
+          </w:tcPr>
+          <w:p>
+            <w:r>
+              <w:t>Destinos legales de e2 en la web</w:t>
+            </w:r>
+          </w:p>
+        </w:tc>
+        <w:tc>
+          <w:tcPr>
+            <w:tcW w:type="dxa" w:w="3216"/>
+          </w:tcPr>
+          <w:p>
+            <w:r>
+              <w:t>10 calentamientos y 30 muestras</w:t>
+            </w:r>
+          </w:p>
+        </w:tc>
+        <w:tc>
+          <w:tcPr>
+            <w:tcW w:type="dxa" w:w="3216"/>
+          </w:tcPr>
+          <w:p>
+            <w:r>
+              <w:t>Mediana 82,88 ms; p95 154,87 ms, incluida automatización.</w:t>
+            </w:r>
+          </w:p>
+        </w:tc>
+      </w:tr>
+    </w:tbl>
+    <w:p>
+      <w:r>
+        <w:t>La posición Java se obtiene con e2-e4, e7-e5, g1-f3, b8-c6, f1-b5 y a7-a6. La IA usa semilla 20261031; todas las respuestas fueron legales. La web consulta e2 en la posición inicial: sus tiempos incluyen Playwright, HTTP y dibujo, por lo que no se comparan directamente con la llamada Java. El p95 se calcula por rango más cercano; con 10 muestras coincide con el máximo.</w:t>
+      </w:r>
+    </w:p>
+    <w:p>
+      <w:pPr>
+        <w:pStyle w:val="Heading2"/>
+      </w:pPr>
+      <w:r>
+        <w:t>Memoria y decisión</w:t>
+      </w:r>
+    </w:p>
+    <w:p>
+      <w:r>
+        <w:t>Tras 500 ciclos Java de partida, seis jugadas, seis deshacer y seis rehacer, el heap posterior a GC pasó de 3.376.184 a 3.397.416 bytes. Ninguna de las 500 partidas observadas mediante referencias débiles permaneció viva al final. El instrumento también conserva esas referencias débiles y explica parte del pequeño crecimiento; no mide una sesión larga con un historial cada vez mayor.</w:t>
+      </w:r>
+    </w:p>
+    <w:p>
+      <w:r>
+        <w:t>En la web, tras 15 ciclos, el heap JavaScript pasó de 2.390.340 a 2.494.620 bytes. Permanecieron 1 documento, 1.118 nodos y 256 listeners. El incremento de 104.280 bytes requiere una campaña más larga y análisis de retenedores si persiste; por sí solo no prueba una fuga. El GC forzado pertenece al diagnóstico, no al juego.</w:t>
+      </w:r>
+    </w:p>
+    <w:p>
+      <w:r>
+        <w:t>JFR concentró muestras en generación de jugadas y validación de movimientos y ataques. Sus pesos de asignación son estimaciones de objetos creados, no memoria retenida. No se identificó un problema que justificara modificar el motor en esta campaña. No hay una mejora antes/después que atribuir. Los presupuestos de búsqueda de la IA tampoco garantizan latencia en otras máquinas.</w:t>
+      </w:r>
+    </w:p>
+    <w:p>
+      <w:r>
+        <w:t>Fuentes reproducibles: docs/rendimiento.md; tools/ProfileChess.java; tools/profile-browser.cjs; docs/evidencias/2026-10-31-etapas5-6-d37cbe4/.</w:t>
+      </w:r>
+    </w:p>
+    <w:p>
+      <w:r>
+        <w:br w:type="page"/>
+      </w:r>
+    </w:p>
+    <w:p>
+      <w:pPr>
+        <w:pStyle w:val="Heading1"/>
+      </w:pPr>
+      <w:r>
+        <w:t>Integridad y cierre técnico</w:t>
+      </w:r>
+    </w:p>
+    <w:p>
+      <w:r>
+        <w:t>Se utilizó asistencia generativa de Codex para revisar el repositorio, contrastar UML, preparar documentación, escribir instrumentos de medición e interpretar las salidas. Las conclusiones técnicas se contrastaron con clases compiladas, pruebas y registros fechados. Esta asistencia es distinta de la IA local del juego, que utiliza minimax con poda alfa-beta.</w:t>
+      </w:r>
+    </w:p>
+    <w:p>
+      <w:pPr>
+        <w:pStyle w:val="Heading2"/>
+      </w:pPr>
+      <w:r>
+        <w:t>Verificaciones realizadas</w:t>
+      </w:r>
+    </w:p>
+    <w:p>
+      <w:r>
+        <w:t>El UML conserva seis vistas y 37 tipos públicos, con las firmas de tiempo activo incorporadas. El informe y la presentación corrigen la cifra antigua de 53 pruebas y la descripción incorrecta del reloj durante los cierres. La ejecución del navegador cubrió el tutorial de seis piezas, puntajes, corona de mate, guardado y recarga, cinco niveles, deshacer y rehacer en modo solo y diseño de 390 px. Se corrigió el selector del test móvil para usar el botón compacto visible; el juego no necesitó cambios.</w:t>
+      </w:r>
+    </w:p>
+    <w:p>
+      <w:r>
+        <w:t>El simulacro automatizado utilizó archivos de prueba y un servidor dedicado. Con el servidor detenido se copió el guardado, se reemplazó la partida de prueba y se restauraron los mismos bytes. Se comprobó igualdad de tablero, turno, modo, nivel, historial, capturas, puntos, estado, tiempo y posibilidad de rehacer. Rehacer recuperó la captura y un punto. Las solicitudes de otro origen devolvieron HTTP 403 y una revisión desactualizada devolvió 409.</w:t>
+      </w:r>
+    </w:p>
+    <w:p>
+      <w:pPr>
+        <w:pStyle w:val="Heading2"/>
+      </w:pPr>
+      <w:r>
+        <w:t>Dependencias y atribución</w:t>
+      </w:r>
+    </w:p>
+    <w:p>
+      <w:r>
+        <w:t>La aplicación usa Java 21 y su servidor HTTP, sin bibliotecas externas de producción declaradas en pom.xml. JUnit 5.11.4 corresponde a pruebas; Maven Compiler 3.13.0 y Surefire 3.5.2 son herramientas de construcción. Playwright y Chrome se usan para verificaciones opcionales. El inventario y las fuentes de licencia constan en docs/dependencias-y-recursos.md. Los dibujos se generan en Canvas; la inspiración en Minecraft no implica afiliación con Mojang o Microsoft.</w:t>
+      </w:r>
+    </w:p>
+    <w:p>
+      <w:pPr>
+        <w:pStyle w:val="Heading2"/>
+      </w:pPr>
+      <w:r>
+        <w:t>Pendientes del grupo antes del 6 de noviembre</w:t>
+      </w:r>
+    </w:p>
+    <w:p>
+      <w:r>
+        <w:t>Otro integrante debe revisar criterios, evidencias, decisiones y limitaciones, registrar sus observaciones y confirmar los responsables. También deben repartir la exposición y ensayar el arranque y la recuperación en el equipo de presentación. Estas acciones humanas no se consideran aprobadas por la revisión asistida ni por una suite automática. El registro de revisión propone seguimiento antes del 5/11; la fecha interna requiere acuerdo del grupo.</w:t>
+      </w:r>
+    </w:p>
+    <w:p>
+      <w:r>
+        <w:t>Fuentes de cierre: docs/integridad-y-cierre.md, docs/dependencias-y-recursos.md y docs/registro-incidencias.md. La entrega queda en RAMA-VICTORIA para revisión; no implica integración automática en la rama principal.</w:t>
       </w:r>
     </w:p>
     <w:sectPr>

</xml_diff>